<commit_message>
feat: add identity verification and project docs sync
</commit_message>
<xml_diff>
--- a/益小助-项目书.docx
+++ b/益小助-项目书.docx
@@ -313,7 +313,7 @@
           <w:rFonts w:ascii="Calibri" w:hAnsi="Calibri" w:eastAsia="Microsoft YaHei"/>
           <w:sz w:val="22"/>
         </w:rPr>
-        <w:t>项目围绕“发布、审核、匹配、对接、反馈”构建完整业务闭环，既符合“AI 赋能·智创未来”的竞赛主题，也具备清晰的移动端落地价值。现阶段项目已经形成前端小程序、后端服务、数据库脚本和配套设计文档的完整骨架，具备继续完善并参与展示答辩的条件。</w:t>
+        <w:t>项目围绕“登录、验证、发布、审核、匹配、对接、反馈”构建完整业务闭环，既符合“AI 赋能·智创未来”的竞赛主题，也具备清晰的移动端落地价值。现阶段项目已经形成前端小程序、后端服务、数据库脚本和配套设计文档的完整骨架，并补充了真实微信登录、学号姓名验证、管理员邀请码和智能识别辅助等能力，具备继续完善并参与展示答辩的条件。</w:t>
       </w:r>
     </w:p>
     <w:p>
@@ -1071,7 +1071,66 @@
                 <w:rFonts w:ascii="Calibri" w:hAnsi="Calibri" w:eastAsia="Microsoft YaHei"/>
                 <w:sz w:val="21"/>
               </w:rPr>
-              <w:t>基于微信授权识别用户身份并区分普通用户与管理员角色</w:t>
+              <w:t>基于微信授权识别用户身份，支持真实微信登录与演示回退</w:t>
+            </w:r>
+          </w:p>
+        </w:tc>
+        <w:tc>
+          <w:tcPr>
+            <w:tcW w:type="dxa" w:w="1584"/>
+            <w:vAlign w:val="center"/>
+          </w:tcPr>
+          <w:p>
+            <w:pPr>
+              <w:spacing w:before="0" w:after="0" w:lineRule="auto" w:line="276"/>
+              <w:jc w:val="center"/>
+            </w:pPr>
+            <w:r>
+              <w:rPr>
+                <w:rFonts w:ascii="Calibri" w:hAnsi="Calibri" w:eastAsia="Microsoft YaHei"/>
+                <w:sz w:val="21"/>
+              </w:rPr>
+              <w:t>高</w:t>
+            </w:r>
+          </w:p>
+        </w:tc>
+      </w:tr>
+      <w:tr>
+        <w:tc>
+          <w:tcPr>
+            <w:tcW w:type="dxa" w:w="1728"/>
+            <w:vAlign w:val="center"/>
+          </w:tcPr>
+          <w:p>
+            <w:pPr>
+              <w:spacing w:before="0" w:after="0" w:lineRule="auto" w:line="276"/>
+              <w:jc w:val="center"/>
+            </w:pPr>
+            <w:r>
+              <w:rPr>
+                <w:rFonts w:ascii="Calibri" w:hAnsi="Calibri" w:eastAsia="Microsoft YaHei"/>
+                <w:sz w:val="21"/>
+              </w:rPr>
+              <w:t>身份验证与授权</w:t>
+            </w:r>
+          </w:p>
+        </w:tc>
+        <w:tc>
+          <w:tcPr>
+            <w:tcW w:type="dxa" w:w="6048"/>
+            <w:vAlign w:val="center"/>
+          </w:tcPr>
+          <w:p>
+            <w:pPr>
+              <w:spacing w:before="0" w:after="0" w:lineRule="auto" w:line="276"/>
+              <w:jc w:val="left"/>
+            </w:pPr>
+            <w:r>
+              <w:rPr>
+                <w:rFonts w:ascii="Calibri" w:hAnsi="Calibri" w:eastAsia="Microsoft YaHei"/>
+                <w:sz w:val="21"/>
+              </w:rPr>
+              <w:t>支持学号姓名验证、一次性管理员邀请码兑换与角色升级</w:t>
             </w:r>
           </w:p>
         </w:tc>
@@ -1130,7 +1189,7 @@
                 <w:rFonts w:ascii="Calibri" w:hAnsi="Calibri" w:eastAsia="Microsoft YaHei"/>
                 <w:sz w:val="21"/>
               </w:rPr>
-              <w:t>支持发布“我有资源”与“我需要资源”两类信息，并填写标题、描述、图片、用户评估价、联系方式等</w:t>
+              <w:t>支持发布“我有资源”与“我需要资源”两类信息，并填写标题、描述、图片、联系方式等</w:t>
             </w:r>
           </w:p>
         </w:tc>
@@ -1248,7 +1307,7 @@
                 <w:rFonts w:ascii="Calibri" w:hAnsi="Calibri" w:eastAsia="Microsoft YaHei"/>
                 <w:sz w:val="21"/>
               </w:rPr>
-              <w:t>自动完成分类、标签提取、文案优化和基础风险提示</w:t>
+              <w:t>自动完成分类、标签提取、文案优化、ISBN 扫码辅助和图片识别建议</w:t>
             </w:r>
           </w:p>
         </w:tc>
@@ -1989,6 +2048,65 @@
           </w:p>
         </w:tc>
       </w:tr>
+      <w:tr>
+        <w:tc>
+          <w:tcPr>
+            <w:tcW w:type="dxa" w:w="2015"/>
+            <w:vAlign w:val="center"/>
+          </w:tcPr>
+          <w:p>
+            <w:pPr>
+              <w:spacing w:before="0" w:after="0" w:lineRule="auto" w:line="276"/>
+              <w:jc w:val="left"/>
+            </w:pPr>
+            <w:r>
+              <w:rPr>
+                <w:rFonts w:ascii="Calibri" w:hAnsi="Calibri" w:eastAsia="Microsoft YaHei"/>
+                <w:sz w:val="21"/>
+              </w:rPr>
+              <w:t>ISBN 扫码辅助</w:t>
+            </w:r>
+          </w:p>
+        </w:tc>
+        <w:tc>
+          <w:tcPr>
+            <w:tcW w:type="dxa" w:w="3168"/>
+            <w:vAlign w:val="center"/>
+          </w:tcPr>
+          <w:p>
+            <w:pPr>
+              <w:spacing w:before="0" w:after="0" w:lineRule="auto" w:line="276"/>
+              <w:jc w:val="left"/>
+            </w:pPr>
+            <w:r>
+              <w:rPr>
+                <w:rFonts w:ascii="Calibri" w:hAnsi="Calibri" w:eastAsia="Microsoft YaHei"/>
+                <w:sz w:val="21"/>
+              </w:rPr>
+              <w:t>扫描教材条码时</w:t>
+            </w:r>
+          </w:p>
+        </w:tc>
+        <w:tc>
+          <w:tcPr>
+            <w:tcW w:type="dxa" w:w="4176"/>
+            <w:vAlign w:val="center"/>
+          </w:tcPr>
+          <w:p>
+            <w:pPr>
+              <w:spacing w:before="0" w:after="0" w:lineRule="auto" w:line="276"/>
+              <w:jc w:val="left"/>
+            </w:pPr>
+            <w:r>
+              <w:rPr>
+                <w:rFonts w:ascii="Calibri" w:hAnsi="Calibri" w:eastAsia="Microsoft YaHei"/>
+                <w:sz w:val="21"/>
+              </w:rPr>
+              <w:t>返回教材标题、分类与标签建议</w:t>
+            </w:r>
+          </w:p>
+        </w:tc>
+      </w:tr>
     </w:tbl>
     <w:tbl>
       <w:tblPr>
@@ -2071,7 +2189,7 @@
           <w:rFonts w:ascii="Calibri" w:hAnsi="Calibri" w:eastAsia="Microsoft YaHei"/>
           <w:sz w:val="22"/>
         </w:rPr>
-        <w:t>用户通过微信授权登录系统，系统根据角色展示普通用户端或管理员端入口。</w:t>
+        <w:t>用户通过微信授权登录系统，系统根据角色展示普通用户端或管理员端入口；未配置微信参数时可回退到演示登录。</w:t>
       </w:r>
     </w:p>
     <w:p>
@@ -2084,7 +2202,20 @@
           <w:rFonts w:ascii="Calibri" w:hAnsi="Calibri" w:eastAsia="Microsoft YaHei"/>
           <w:sz w:val="22"/>
         </w:rPr>
-        <w:t>普通用户在发布页填写资源或需求信息，并触发 AI 分类、标签提取和文案优化。</w:t>
+        <w:t>普通用户可先在设置页完成学号姓名验证，并在需要时通过一次性管理员邀请码升级为管理员。</w:t>
+      </w:r>
+    </w:p>
+    <w:p>
+      <w:pPr>
+        <w:pStyle w:val="ListNumber"/>
+        <w:spacing w:before="0" w:after="80" w:lineRule="auto" w:line="290"/>
+      </w:pPr>
+      <w:r>
+        <w:rPr>
+          <w:rFonts w:ascii="Calibri" w:hAnsi="Calibri" w:eastAsia="Microsoft YaHei"/>
+          <w:sz w:val="22"/>
+        </w:rPr>
+        <w:t>普通用户在发布页填写资源或需求信息，并触发 AI 分类、标签提取、文案优化、ISBN 扫码或图片识别辅助。</w:t>
       </w:r>
     </w:p>
     <w:p>
@@ -2287,7 +2418,7 @@
                 <w:rFonts w:ascii="Calibri" w:hAnsi="Calibri" w:eastAsia="Microsoft YaHei"/>
                 <w:sz w:val="21"/>
               </w:rPr>
-              <w:t>openid、nickname、role、phone、college</w:t>
+              <w:t>openid、nickname、student_no、real_name、identity_verified、role、credit_score</w:t>
             </w:r>
           </w:p>
         </w:tc>
@@ -2346,7 +2477,7 @@
                 <w:rFonts w:ascii="Calibri" w:hAnsi="Calibri" w:eastAsia="Microsoft YaHei"/>
                 <w:sz w:val="21"/>
               </w:rPr>
-              <w:t>title、description、category、tags、image_urls、estimated_price、review_status、flow_status</w:t>
+              <w:t>title、description、category、tags、image_urls、review_status、flow_status</w:t>
             </w:r>
           </w:p>
         </w:tc>
@@ -2405,7 +2536,7 @@
                 <w:rFonts w:ascii="Calibri" w:hAnsi="Calibri" w:eastAsia="Microsoft YaHei"/>
                 <w:sz w:val="21"/>
               </w:rPr>
-              <w:t>title、description、category、tags、estimated_price、urgency_level、review_status</w:t>
+              <w:t>title、description、category、tags、urgency_level、review_status</w:t>
             </w:r>
           </w:p>
         </w:tc>
@@ -2606,6 +2737,124 @@
           </w:p>
         </w:tc>
       </w:tr>
+      <w:tr>
+        <w:tc>
+          <w:tcPr>
+            <w:tcW w:type="dxa" w:w="2015"/>
+            <w:vAlign w:val="center"/>
+          </w:tcPr>
+          <w:p>
+            <w:pPr>
+              <w:spacing w:before="0" w:after="0" w:lineRule="auto" w:line="276"/>
+              <w:jc w:val="left"/>
+            </w:pPr>
+            <w:r>
+              <w:rPr>
+                <w:rFonts w:ascii="Calibri" w:hAnsi="Calibri" w:eastAsia="Microsoft YaHei"/>
+                <w:sz w:val="21"/>
+              </w:rPr>
+              <w:t>admin_invite_code</w:t>
+            </w:r>
+          </w:p>
+        </w:tc>
+        <w:tc>
+          <w:tcPr>
+            <w:tcW w:type="dxa" w:w="4320"/>
+            <w:vAlign w:val="center"/>
+          </w:tcPr>
+          <w:p>
+            <w:pPr>
+              <w:spacing w:before="0" w:after="0" w:lineRule="auto" w:line="276"/>
+              <w:jc w:val="left"/>
+            </w:pPr>
+            <w:r>
+              <w:rPr>
+                <w:rFonts w:ascii="Calibri" w:hAnsi="Calibri" w:eastAsia="Microsoft YaHei"/>
+                <w:sz w:val="21"/>
+              </w:rPr>
+              <w:t>invite_code、used、disabled、used_by、used_at</w:t>
+            </w:r>
+          </w:p>
+        </w:tc>
+        <w:tc>
+          <w:tcPr>
+            <w:tcW w:type="dxa" w:w="3024"/>
+            <w:vAlign w:val="center"/>
+          </w:tcPr>
+          <w:p>
+            <w:pPr>
+              <w:spacing w:before="0" w:after="0" w:lineRule="auto" w:line="276"/>
+              <w:jc w:val="left"/>
+            </w:pPr>
+            <w:r>
+              <w:rPr>
+                <w:rFonts w:ascii="Calibri" w:hAnsi="Calibri" w:eastAsia="Microsoft YaHei"/>
+                <w:sz w:val="21"/>
+              </w:rPr>
+              <w:t>存储一次性管理员邀请码状态</w:t>
+            </w:r>
+          </w:p>
+        </w:tc>
+      </w:tr>
+      <w:tr>
+        <w:tc>
+          <w:tcPr>
+            <w:tcW w:type="dxa" w:w="2015"/>
+            <w:vAlign w:val="center"/>
+          </w:tcPr>
+          <w:p>
+            <w:pPr>
+              <w:spacing w:before="0" w:after="0" w:lineRule="auto" w:line="276"/>
+              <w:jc w:val="left"/>
+            </w:pPr>
+            <w:r>
+              <w:rPr>
+                <w:rFonts w:ascii="Calibri" w:hAnsi="Calibri" w:eastAsia="Microsoft YaHei"/>
+                <w:sz w:val="21"/>
+              </w:rPr>
+              <w:t>feedback</w:t>
+            </w:r>
+          </w:p>
+        </w:tc>
+        <w:tc>
+          <w:tcPr>
+            <w:tcW w:type="dxa" w:w="4320"/>
+            <w:vAlign w:val="center"/>
+          </w:tcPr>
+          <w:p>
+            <w:pPr>
+              <w:spacing w:before="0" w:after="0" w:lineRule="auto" w:line="276"/>
+              <w:jc w:val="left"/>
+            </w:pPr>
+            <w:r>
+              <w:rPr>
+                <w:rFonts w:ascii="Calibri" w:hAnsi="Calibri" w:eastAsia="Microsoft YaHei"/>
+                <w:sz w:val="21"/>
+              </w:rPr>
+              <w:t>match_id、from_user_id、to_user_id、rating、credit_delta</w:t>
+            </w:r>
+          </w:p>
+        </w:tc>
+        <w:tc>
+          <w:tcPr>
+            <w:tcW w:type="dxa" w:w="3024"/>
+            <w:vAlign w:val="center"/>
+          </w:tcPr>
+          <w:p>
+            <w:pPr>
+              <w:spacing w:before="0" w:after="0" w:lineRule="auto" w:line="276"/>
+              <w:jc w:val="left"/>
+            </w:pPr>
+            <w:r>
+              <w:rPr>
+                <w:rFonts w:ascii="Calibri" w:hAnsi="Calibri" w:eastAsia="Microsoft YaHei"/>
+                <w:sz w:val="21"/>
+              </w:rPr>
+              <w:t>存储评价与信誉变化记录</w:t>
+            </w:r>
+          </w:p>
+        </w:tc>
+      </w:tr>
     </w:tbl>
     <w:p>
       <w:pPr>
@@ -2617,7 +2866,7 @@
           <w:rFonts w:ascii="Calibri" w:hAnsi="Calibri" w:eastAsia="Microsoft YaHei"/>
           <w:sz w:val="22"/>
         </w:rPr>
-        <w:t>其中，用户评估价字段用于表达发布者对物资或需求价值的主观参考判断，便于供需双方沟通和平台后续排序展示。该字段仅用于公益流转中的价值参考，不作为平台交易定价依据。</w:t>
+        <w:t>其中，`identity_verified` 与 `admin_invite_code` 共同构成当前版本的权限治理基础，分别用于完成学号姓名验证和一次性管理员授权。评价闭环则通过 `feedback`、`credit_score` 与 `rating_count` 等字段完成信誉沉淀。</w:t>
       </w:r>
     </w:p>
     <w:p>
@@ -2671,7 +2920,7 @@
           <w:rFonts w:ascii="Calibri" w:hAnsi="Calibri" w:eastAsia="Microsoft YaHei"/>
           <w:sz w:val="22"/>
         </w:rPr>
-        <w:t>前端小程序目录 `miniprogram` 已包含首页、分类、发布、匹配、详情、消息、我的和后台管理页面结构。</w:t>
+        <w:t>前端小程序目录 `miniprogram` 已包含首页、分类、发布、匹配、详情、消息、我的、设置和后台管理页面结构。</w:t>
       </w:r>
     </w:p>
     <w:p>
@@ -2697,7 +2946,7 @@
           <w:rFonts w:ascii="Calibri" w:hAnsi="Calibri" w:eastAsia="Microsoft YaHei"/>
           <w:sz w:val="22"/>
         </w:rPr>
-        <w:t>数据库目录 `database` 已提供 MySQL 建表脚本与种子数据。</w:t>
+        <w:t>数据库目录 `database` 已提供 MySQL 建表脚本、管理员邀请码迁移脚本与种子数据。</w:t>
       </w:r>
     </w:p>
     <w:p>
@@ -2736,7 +2985,20 @@
           <w:rFonts w:ascii="Calibri" w:hAnsi="Calibri" w:eastAsia="Microsoft YaHei"/>
           <w:sz w:val="22"/>
         </w:rPr>
-        <w:t>项目文档已同步纳入用户评估价功能，用于资源价值参考、展示与后续匹配沟通。</w:t>
+        <w:t>当前版本已支持真实微信登录与演示回退、学号姓名验证、管理员邀请码兑换。</w:t>
+      </w:r>
+    </w:p>
+    <w:p>
+      <w:pPr>
+        <w:pStyle w:val="ListBullet"/>
+        <w:spacing w:before="0" w:after="80" w:lineRule="auto" w:line="290"/>
+      </w:pPr>
+      <w:r>
+        <w:rPr>
+          <w:rFonts w:ascii="Calibri" w:hAnsi="Calibri" w:eastAsia="Microsoft YaHei"/>
+          <w:sz w:val="22"/>
+        </w:rPr>
+        <w:t>当前版本已支持 ISBN 扫码辅助与图片识别辅助录入，便于教材和物品信息快速填充。</w:t>
       </w:r>
     </w:p>
     <w:p>
@@ -4214,7 +4476,7 @@
                 <w:rFonts w:ascii="Calibri" w:hAnsi="Calibri" w:eastAsia="Microsoft YaHei"/>
                 <w:sz w:val="21"/>
               </w:rPr>
-              <w:t>用户评估价</w:t>
+              <w:t>身份验证与授权</w:t>
             </w:r>
           </w:p>
         </w:tc>
@@ -4233,7 +4495,7 @@
                 <w:rFonts w:ascii="Calibri" w:hAnsi="Calibri" w:eastAsia="Microsoft YaHei"/>
                 <w:sz w:val="21"/>
               </w:rPr>
-              <w:t>发布资源或需求时可填写用户评估价，作为物资价值参考和沟通辅助信息</w:t>
+              <w:t>设置页支持学号姓名验证与一次性管理员邀请码兑换</w:t>
             </w:r>
           </w:p>
         </w:tc>
@@ -4252,7 +4514,66 @@
                 <w:rFonts w:ascii="Calibri" w:hAnsi="Calibri" w:eastAsia="Microsoft YaHei"/>
                 <w:sz w:val="21"/>
               </w:rPr>
-              <w:t>帮助双方快速判断资源适配度和流转预期</w:t>
+              <w:t>保证平台治理入口可信可控</w:t>
+            </w:r>
+          </w:p>
+        </w:tc>
+      </w:tr>
+      <w:tr>
+        <w:tc>
+          <w:tcPr>
+            <w:tcW w:type="dxa" w:w="1728"/>
+            <w:vAlign w:val="center"/>
+          </w:tcPr>
+          <w:p>
+            <w:pPr>
+              <w:spacing w:before="0" w:after="0" w:lineRule="auto" w:line="276"/>
+              <w:jc w:val="center"/>
+            </w:pPr>
+            <w:r>
+              <w:rPr>
+                <w:rFonts w:ascii="Calibri" w:hAnsi="Calibri" w:eastAsia="Microsoft YaHei"/>
+                <w:sz w:val="21"/>
+              </w:rPr>
+              <w:t>智能识别辅助</w:t>
+            </w:r>
+          </w:p>
+        </w:tc>
+        <w:tc>
+          <w:tcPr>
+            <w:tcW w:type="dxa" w:w="5040"/>
+            <w:vAlign w:val="center"/>
+          </w:tcPr>
+          <w:p>
+            <w:pPr>
+              <w:spacing w:before="0" w:after="0" w:lineRule="auto" w:line="276"/>
+              <w:jc w:val="left"/>
+            </w:pPr>
+            <w:r>
+              <w:rPr>
+                <w:rFonts w:ascii="Calibri" w:hAnsi="Calibri" w:eastAsia="Microsoft YaHei"/>
+                <w:sz w:val="21"/>
+              </w:rPr>
+              <w:t>发布页支持 ISBN 扫码、相机识别物品和上传图片识别</w:t>
+            </w:r>
+          </w:p>
+        </w:tc>
+        <w:tc>
+          <w:tcPr>
+            <w:tcW w:type="dxa" w:w="2592"/>
+            <w:vAlign w:val="center"/>
+          </w:tcPr>
+          <w:p>
+            <w:pPr>
+              <w:spacing w:before="0" w:after="0" w:lineRule="auto" w:line="276"/>
+              <w:jc w:val="left"/>
+            </w:pPr>
+            <w:r>
+              <w:rPr>
+                <w:rFonts w:ascii="Calibri" w:hAnsi="Calibri" w:eastAsia="Microsoft YaHei"/>
+                <w:sz w:val="21"/>
+              </w:rPr>
+              <w:t>降低录入成本，提升比赛展示亮点</w:t>
             </w:r>
           </w:p>
         </w:tc>
@@ -4386,7 +4707,7 @@
           <w:rFonts w:ascii="Calibri" w:hAnsi="Calibri" w:eastAsia="Microsoft YaHei"/>
           <w:sz w:val="22"/>
         </w:rPr>
-        <w:t>其中，用户评估价并不代表平台鼓励交易，而是作为公益资源流转中的参考信息，帮助发布者更准确描述物资价值、帮助接收方判断资源适用性，也有助于后续在列表、详情和匹配结果中提供更清晰的信息展示。</w:t>
+        <w:t>其中，身份验证和管理员邀请码使平台具备了更完整的角色治理路径：普通用户先完成学号姓名验证，再通过一次性邀请码升级为管理员；首个超级管理员则由部署阶段手动指定，便于控制后台权限扩散。</w:t>
       </w:r>
     </w:p>
     <w:p>
@@ -4399,7 +4720,7 @@
           <w:rFonts w:ascii="Calibri" w:hAnsi="Calibri" w:eastAsia="Microsoft YaHei"/>
           <w:sz w:val="22"/>
         </w:rPr>
-        <w:t>如果后续切换到正式数据库存储，建议在 `resource` 与 `need` 表中增加 `estimated_price` 字段，类型可采用 `decimal(10,2)`，并在前端表单、详情页和后台审核页同步展示该字段，以保持项目文档、接口设计和系统实现的一致性。</w:t>
+        <w:t>关于“用户评估价”，当前项目材料仍将其作为可扩展展示字段保留，用于公益资源的参考价值说明；若后续与正式数据库持久化完全对齐，建议再在 `resource` 与 `need` 表中增加 `estimated_price` 字段，以保持产品说明、接口设计和系统实现的一致性。</w:t>
       </w:r>
     </w:p>
     <w:sectPr>

</xml_diff>